<commit_message>
Plantilla del manual - Completo
Apartados Licencia y Requisitos mejorados
</commit_message>
<xml_diff>
--- a/Programacion/Manual de usuario/Plantilla manual usuario.docx
+++ b/Programacion/Manual de usuario/Plantilla manual usuario.docx
@@ -60,7 +60,7 @@
       <w:pPr>
         <w:pStyle w:val="Heading1"/>
       </w:pPr>
-      <w:bookmarkStart w:name="_Toc1905990964" w:id="533634412"/>
+      <w:bookmarkStart w:name="_Toc990766149" w:id="967614127"/>
       <w:r>
         <w:rPr>
           <w:b w:val="1"/>
@@ -69,10 +69,10 @@
         </w:rPr>
         <w:t>Índice</w:t>
       </w:r>
-      <w:bookmarkEnd w:id="533634412"/>
       <w:r>
         <w:br/>
       </w:r>
+      <w:bookmarkEnd w:id="967614127"/>
     </w:p>
     <w:sdt>
       <w:sdtPr>
@@ -89,7 +89,6 @@
             <w:tabs>
               <w:tab w:val="right" w:leader="dot" w:pos="9015"/>
             </w:tabs>
-            <w:bidi w:val="0"/>
             <w:rPr>
               <w:rStyle w:val="Hyperlink"/>
             </w:rPr>
@@ -98,12 +97,12 @@
             <w:fldChar w:fldCharType="begin"/>
           </w:r>
           <w:r>
-            <w:instrText xml:space="preserve">TOC \o \z \u \h</w:instrText>
+            <w:instrText xml:space="preserve">TOC \o "1-9" \z \u \h</w:instrText>
           </w:r>
           <w:r>
             <w:fldChar w:fldCharType="separate"/>
           </w:r>
-          <w:hyperlink w:anchor="_Toc1905990964">
+          <w:hyperlink w:anchor="_Toc990766149">
             <w:r>
               <w:rPr>
                 <w:rStyle w:val="Hyperlink"/>
@@ -117,7 +116,283 @@
               <w:fldChar w:fldCharType="begin"/>
             </w:r>
             <w:r>
-              <w:instrText xml:space="preserve">PAGEREF _Toc1905990964 \h</w:instrText>
+              <w:instrText xml:space="preserve">PAGEREF _Toc990766149 \h</w:instrText>
+            </w:r>
+            <w:r>
+              <w:fldChar w:fldCharType="separate"/>
+            </w:r>
+            <w:r>
+              <w:rPr>
+                <w:rStyle w:val="Hyperlink"/>
+              </w:rPr>
+              <w:t>1</w:t>
+            </w:r>
+            <w:r>
+              <w:fldChar w:fldCharType="end"/>
+            </w:r>
+          </w:hyperlink>
+        </w:p>
+        <w:p>
+          <w:pPr>
+            <w:pStyle w:val="TOC1"/>
+            <w:tabs>
+              <w:tab w:val="right" w:leader="dot" w:pos="9015"/>
+            </w:tabs>
+            <w:rPr>
+              <w:rStyle w:val="Hyperlink"/>
+            </w:rPr>
+          </w:pPr>
+          <w:hyperlink w:anchor="_Toc706168727">
+            <w:r>
+              <w:rPr>
+                <w:rStyle w:val="Hyperlink"/>
+              </w:rPr>
+              <w:t>Licencia</w:t>
+            </w:r>
+            <w:r>
+              <w:tab/>
+            </w:r>
+            <w:r>
+              <w:fldChar w:fldCharType="begin"/>
+            </w:r>
+            <w:r>
+              <w:instrText xml:space="preserve">PAGEREF _Toc706168727 \h</w:instrText>
+            </w:r>
+            <w:r>
+              <w:fldChar w:fldCharType="separate"/>
+            </w:r>
+            <w:r>
+              <w:rPr>
+                <w:rStyle w:val="Hyperlink"/>
+              </w:rPr>
+              <w:t>1</w:t>
+            </w:r>
+            <w:r>
+              <w:fldChar w:fldCharType="end"/>
+            </w:r>
+          </w:hyperlink>
+        </w:p>
+        <w:p>
+          <w:pPr>
+            <w:pStyle w:val="TOC2"/>
+            <w:tabs>
+              <w:tab w:val="right" w:leader="dot" w:pos="9015"/>
+            </w:tabs>
+            <w:rPr>
+              <w:rStyle w:val="Hyperlink"/>
+            </w:rPr>
+          </w:pPr>
+          <w:hyperlink w:anchor="_Toc1837261785">
+            <w:r>
+              <w:rPr>
+                <w:rStyle w:val="Hyperlink"/>
+              </w:rPr>
+              <w:t>Licencia de la aplicación</w:t>
+            </w:r>
+            <w:r>
+              <w:tab/>
+            </w:r>
+            <w:r>
+              <w:fldChar w:fldCharType="begin"/>
+            </w:r>
+            <w:r>
+              <w:instrText xml:space="preserve">PAGEREF _Toc1837261785 \h</w:instrText>
+            </w:r>
+            <w:r>
+              <w:fldChar w:fldCharType="separate"/>
+            </w:r>
+            <w:r>
+              <w:rPr>
+                <w:rStyle w:val="Hyperlink"/>
+              </w:rPr>
+              <w:t>1</w:t>
+            </w:r>
+            <w:r>
+              <w:fldChar w:fldCharType="end"/>
+            </w:r>
+          </w:hyperlink>
+        </w:p>
+        <w:p>
+          <w:pPr>
+            <w:pStyle w:val="TOC2"/>
+            <w:tabs>
+              <w:tab w:val="right" w:leader="dot" w:pos="9015"/>
+            </w:tabs>
+            <w:rPr>
+              <w:rStyle w:val="Hyperlink"/>
+            </w:rPr>
+          </w:pPr>
+          <w:hyperlink w:anchor="_Toc23336550">
+            <w:r>
+              <w:rPr>
+                <w:rStyle w:val="Hyperlink"/>
+              </w:rPr>
+              <w:t>Otros tipos de licencia</w:t>
+            </w:r>
+            <w:r>
+              <w:tab/>
+            </w:r>
+            <w:r>
+              <w:fldChar w:fldCharType="begin"/>
+            </w:r>
+            <w:r>
+              <w:instrText xml:space="preserve">PAGEREF _Toc23336550 \h</w:instrText>
+            </w:r>
+            <w:r>
+              <w:fldChar w:fldCharType="separate"/>
+            </w:r>
+            <w:r>
+              <w:rPr>
+                <w:rStyle w:val="Hyperlink"/>
+              </w:rPr>
+              <w:t>1</w:t>
+            </w:r>
+            <w:r>
+              <w:fldChar w:fldCharType="end"/>
+            </w:r>
+          </w:hyperlink>
+        </w:p>
+        <w:p>
+          <w:pPr>
+            <w:pStyle w:val="TOC2"/>
+            <w:tabs>
+              <w:tab w:val="right" w:leader="dot" w:pos="9015"/>
+            </w:tabs>
+            <w:rPr>
+              <w:rStyle w:val="Hyperlink"/>
+            </w:rPr>
+          </w:pPr>
+          <w:hyperlink w:anchor="_Toc657926701">
+            <w:r>
+              <w:rPr>
+                <w:rStyle w:val="Hyperlink"/>
+              </w:rPr>
+              <w:t>Comparación entre licencias</w:t>
+            </w:r>
+            <w:r>
+              <w:tab/>
+            </w:r>
+            <w:r>
+              <w:fldChar w:fldCharType="begin"/>
+            </w:r>
+            <w:r>
+              <w:instrText xml:space="preserve">PAGEREF _Toc657926701 \h</w:instrText>
+            </w:r>
+            <w:r>
+              <w:fldChar w:fldCharType="separate"/>
+            </w:r>
+            <w:r>
+              <w:rPr>
+                <w:rStyle w:val="Hyperlink"/>
+              </w:rPr>
+              <w:t>1</w:t>
+            </w:r>
+            <w:r>
+              <w:fldChar w:fldCharType="end"/>
+            </w:r>
+          </w:hyperlink>
+        </w:p>
+        <w:p>
+          <w:pPr>
+            <w:pStyle w:val="TOC1"/>
+            <w:tabs>
+              <w:tab w:val="right" w:leader="dot" w:pos="9015"/>
+            </w:tabs>
+            <w:rPr>
+              <w:rStyle w:val="Hyperlink"/>
+            </w:rPr>
+          </w:pPr>
+          <w:hyperlink w:anchor="_Toc913460600">
+            <w:r>
+              <w:rPr>
+                <w:rStyle w:val="Hyperlink"/>
+              </w:rPr>
+              <w:t>Requisitos</w:t>
+            </w:r>
+            <w:r>
+              <w:tab/>
+            </w:r>
+            <w:r>
+              <w:fldChar w:fldCharType="begin"/>
+            </w:r>
+            <w:r>
+              <w:instrText xml:space="preserve">PAGEREF _Toc913460600 \h</w:instrText>
+            </w:r>
+            <w:r>
+              <w:fldChar w:fldCharType="separate"/>
+            </w:r>
+            <w:r>
+              <w:rPr>
+                <w:rStyle w:val="Hyperlink"/>
+              </w:rPr>
+              <w:t>1</w:t>
+            </w:r>
+            <w:r>
+              <w:fldChar w:fldCharType="end"/>
+            </w:r>
+          </w:hyperlink>
+        </w:p>
+        <w:p>
+          <w:pPr>
+            <w:pStyle w:val="TOC2"/>
+            <w:tabs>
+              <w:tab w:val="right" w:leader="dot" w:pos="9015"/>
+            </w:tabs>
+            <w:bidi w:val="0"/>
+          </w:pPr>
+          <w:hyperlink w:anchor="_Toc447761473">
+            <w:r>
+              <w:rPr>
+                <w:rStyle w:val="Hyperlink"/>
+              </w:rPr>
+              <w:t>Requisitos de Hardware</w:t>
+            </w:r>
+            <w:r>
+              <w:tab/>
+            </w:r>
+            <w:r>
+              <w:fldChar w:fldCharType="begin"/>
+            </w:r>
+            <w:r>
+              <w:instrText xml:space="preserve">PAGEREF _Toc447761473 \h</w:instrText>
+            </w:r>
+            <w:r>
+              <w:fldChar w:fldCharType="separate"/>
+            </w:r>
+            <w:r>
+              <w:rPr>
+                <w:rStyle w:val="Hyperlink"/>
+              </w:rPr>
+              <w:t>1</w:t>
+            </w:r>
+            <w:r>
+              <w:fldChar w:fldCharType="end"/>
+            </w:r>
+          </w:hyperlink>
+        </w:p>
+        <w:p>
+          <w:pPr>
+            <w:pStyle w:val="TOC2"/>
+            <w:tabs>
+              <w:tab w:val="right" w:leader="dot" w:pos="9015"/>
+            </w:tabs>
+            <w:bidi w:val="0"/>
+          </w:pPr>
+          <w:hyperlink w:anchor="_Toc447978699">
+            <w:r>
+              <w:rPr>
+                <w:rStyle w:val="Hyperlink"/>
+              </w:rPr>
+              <w:t>Requisitos de Software</w:t>
+            </w:r>
+            <w:r>
+              <w:tab/>
+            </w:r>
+            <w:r>
+              <w:fldChar w:fldCharType="begin"/>
+            </w:r>
+            <w:r>
+              <w:instrText xml:space="preserve">PAGEREF _Toc447978699 \h</w:instrText>
             </w:r>
             <w:r>
               <w:fldChar w:fldCharType="separate"/>
@@ -140,16 +415,13 @@
               <w:tab w:val="right" w:leader="dot" w:pos="9015"/>
             </w:tabs>
             <w:bidi w:val="0"/>
-            <w:rPr>
-              <w:rStyle w:val="Hyperlink"/>
-            </w:rPr>
-          </w:pPr>
-          <w:hyperlink w:anchor="_Toc367787184">
-            <w:r>
-              <w:rPr>
-                <w:rStyle w:val="Hyperlink"/>
-              </w:rPr>
-              <w:t>Licencia</w:t>
+          </w:pPr>
+          <w:hyperlink w:anchor="_Toc2068599848">
+            <w:r>
+              <w:rPr>
+                <w:rStyle w:val="Hyperlink"/>
+              </w:rPr>
+              <w:t>Instalación</w:t>
             </w:r>
             <w:r>
               <w:tab/>
@@ -158,7 +430,7 @@
               <w:fldChar w:fldCharType="begin"/>
             </w:r>
             <w:r>
-              <w:instrText xml:space="preserve">PAGEREF _Toc367787184 \h</w:instrText>
+              <w:instrText xml:space="preserve">PAGEREF _Toc2068599848 \h</w:instrText>
             </w:r>
             <w:r>
               <w:fldChar w:fldCharType="separate"/>
@@ -181,16 +453,13 @@
               <w:tab w:val="right" w:leader="dot" w:pos="9015"/>
             </w:tabs>
             <w:bidi w:val="0"/>
-            <w:rPr>
-              <w:rStyle w:val="Hyperlink"/>
-            </w:rPr>
-          </w:pPr>
-          <w:hyperlink w:anchor="_Toc1829695671">
-            <w:r>
-              <w:rPr>
-                <w:rStyle w:val="Hyperlink"/>
-              </w:rPr>
-              <w:t>Requisitos</w:t>
+          </w:pPr>
+          <w:hyperlink w:anchor="_Toc845755088">
+            <w:r>
+              <w:rPr>
+                <w:rStyle w:val="Hyperlink"/>
+              </w:rPr>
+              <w:t>Guía de uso</w:t>
             </w:r>
             <w:r>
               <w:tab/>
@@ -199,7 +468,7 @@
               <w:fldChar w:fldCharType="begin"/>
             </w:r>
             <w:r>
-              <w:instrText xml:space="preserve">PAGEREF _Toc1829695671 \h</w:instrText>
+              <w:instrText xml:space="preserve">PAGEREF _Toc845755088 \h</w:instrText>
             </w:r>
             <w:r>
               <w:fldChar w:fldCharType="separate"/>
@@ -208,7 +477,7 @@
               <w:rPr>
                 <w:rStyle w:val="Hyperlink"/>
               </w:rPr>
-              <w:t>1</w:t>
+              <w:t>2</w:t>
             </w:r>
             <w:r>
               <w:fldChar w:fldCharType="end"/>
@@ -222,16 +491,13 @@
               <w:tab w:val="right" w:leader="dot" w:pos="9015"/>
             </w:tabs>
             <w:bidi w:val="0"/>
-            <w:rPr>
-              <w:rStyle w:val="Hyperlink"/>
-            </w:rPr>
-          </w:pPr>
-          <w:hyperlink w:anchor="_Toc2133038377">
-            <w:r>
-              <w:rPr>
-                <w:rStyle w:val="Hyperlink"/>
-              </w:rPr>
-              <w:t>Instalación</w:t>
+          </w:pPr>
+          <w:hyperlink w:anchor="_Toc1447281205">
+            <w:r>
+              <w:rPr>
+                <w:rStyle w:val="Hyperlink"/>
+              </w:rPr>
+              <w:t>Problemas frecuentes y solución</w:t>
             </w:r>
             <w:r>
               <w:tab/>
@@ -240,7 +506,7 @@
               <w:fldChar w:fldCharType="begin"/>
             </w:r>
             <w:r>
-              <w:instrText xml:space="preserve">PAGEREF _Toc2133038377 \h</w:instrText>
+              <w:instrText xml:space="preserve">PAGEREF _Toc1447281205 \h</w:instrText>
             </w:r>
             <w:r>
               <w:fldChar w:fldCharType="separate"/>
@@ -249,89 +515,7 @@
               <w:rPr>
                 <w:rStyle w:val="Hyperlink"/>
               </w:rPr>
-              <w:t>1</w:t>
-            </w:r>
-            <w:r>
-              <w:fldChar w:fldCharType="end"/>
-            </w:r>
-          </w:hyperlink>
-        </w:p>
-        <w:p>
-          <w:pPr>
-            <w:pStyle w:val="TOC1"/>
-            <w:tabs>
-              <w:tab w:val="right" w:leader="dot" w:pos="9015"/>
-            </w:tabs>
-            <w:bidi w:val="0"/>
-            <w:rPr>
-              <w:rStyle w:val="Hyperlink"/>
-            </w:rPr>
-          </w:pPr>
-          <w:hyperlink w:anchor="_Toc1489319826">
-            <w:r>
-              <w:rPr>
-                <w:rStyle w:val="Hyperlink"/>
-              </w:rPr>
-              <w:t>Guía de uso</w:t>
-            </w:r>
-            <w:r>
-              <w:tab/>
-            </w:r>
-            <w:r>
-              <w:fldChar w:fldCharType="begin"/>
-            </w:r>
-            <w:r>
-              <w:instrText xml:space="preserve">PAGEREF _Toc1489319826 \h</w:instrText>
-            </w:r>
-            <w:r>
-              <w:fldChar w:fldCharType="separate"/>
-            </w:r>
-            <w:r>
-              <w:rPr>
-                <w:rStyle w:val="Hyperlink"/>
-              </w:rPr>
-              <w:t>1</w:t>
-            </w:r>
-            <w:r>
-              <w:fldChar w:fldCharType="end"/>
-            </w:r>
-          </w:hyperlink>
-        </w:p>
-        <w:p>
-          <w:pPr>
-            <w:pStyle w:val="TOC1"/>
-            <w:tabs>
-              <w:tab w:val="right" w:leader="dot" w:pos="9015"/>
-            </w:tabs>
-            <w:bidi w:val="0"/>
-            <w:rPr>
-              <w:rStyle w:val="Hyperlink"/>
-            </w:rPr>
-          </w:pPr>
-          <w:hyperlink w:anchor="_Toc1775807923">
-            <w:r>
-              <w:rPr>
-                <w:rStyle w:val="Hyperlink"/>
-              </w:rPr>
-              <w:t>Problemas frecuentes y solución</w:t>
-            </w:r>
-            <w:r>
-              <w:tab/>
-            </w:r>
-            <w:r>
-              <w:fldChar w:fldCharType="begin"/>
-            </w:r>
-            <w:r>
-              <w:instrText xml:space="preserve">PAGEREF _Toc1775807923 \h</w:instrText>
-            </w:r>
-            <w:r>
-              <w:fldChar w:fldCharType="separate"/>
-            </w:r>
-            <w:r>
-              <w:rPr>
-                <w:rStyle w:val="Hyperlink"/>
-              </w:rPr>
-              <w:t>1</w:t>
+              <w:t>2</w:t>
             </w:r>
             <w:r>
               <w:fldChar w:fldCharType="end"/>
@@ -348,11 +532,12 @@
     <w:p>
       <w:pPr>
         <w:pStyle w:val="Heading1"/>
+        <w:rPr>
+          <w:b w:val="1"/>
+          <w:bCs w:val="1"/>
+        </w:rPr>
       </w:pPr>
-      <w:bookmarkStart w:name="_Toc367787184" w:id="652352543"/>
-      <w:r>
-        <w:br/>
-      </w:r>
+      <w:bookmarkStart w:name="_Toc706168727" w:id="734204282"/>
       <w:r>
         <w:rPr>
           <w:b w:val="1"/>
@@ -360,7 +545,54 @@
         </w:rPr>
         <w:t>Licencia</w:t>
       </w:r>
-      <w:bookmarkEnd w:id="652352543"/>
+      <w:bookmarkEnd w:id="734204282"/>
+    </w:p>
+    <w:p>
+      <w:pPr>
+        <w:pStyle w:val="Heading2"/>
+      </w:pPr>
+      <w:bookmarkStart w:name="_Toc1837261785" w:id="727168979"/>
+      <w:r>
+        <w:rPr/>
+        <w:t>Licencia de la aplicación</w:t>
+      </w:r>
+      <w:bookmarkEnd w:id="727168979"/>
+    </w:p>
+    <w:p>
+      <w:pPr>
+        <w:pStyle w:val="Heading2"/>
+      </w:pPr>
+      <w:bookmarkStart w:name="_Toc23336550" w:id="1381899257"/>
+      <w:r>
+        <w:rPr/>
+        <w:t>Otros tipos de licencia</w:t>
+      </w:r>
+      <w:bookmarkEnd w:id="1381899257"/>
+    </w:p>
+    <w:p>
+      <w:pPr>
+        <w:pStyle w:val="Heading2"/>
+      </w:pPr>
+      <w:bookmarkStart w:name="_Toc657926701" w:id="158255671"/>
+      <w:r>
+        <w:rPr/>
+        <w:t>Comparación entre licencias</w:t>
+      </w:r>
+      <w:bookmarkEnd w:id="158255671"/>
+    </w:p>
+    <w:p>
+      <w:pPr>
+        <w:pStyle w:val="Normal"/>
+      </w:pPr>
+      <w:r>
+        <w:rPr/>
+        <w:t>(Mínimo tres licencias: MIT, GPL v3, Apache 2.0)</w:t>
+      </w:r>
+    </w:p>
+    <w:p>
+      <w:pPr>
+        <w:pStyle w:val="Normal"/>
+      </w:pPr>
     </w:p>
     <w:p>
       <w:pPr>
@@ -370,7 +602,7 @@
           <w:bCs w:val="1"/>
         </w:rPr>
       </w:pPr>
-      <w:bookmarkStart w:name="_Toc1829695671" w:id="2143078541"/>
+      <w:bookmarkStart w:name="_Toc913460600" w:id="816798723"/>
       <w:r>
         <w:rPr>
           <w:b w:val="1"/>
@@ -378,7 +610,163 @@
         </w:rPr>
         <w:t>Requisitos</w:t>
       </w:r>
-      <w:bookmarkEnd w:id="2143078541"/>
+      <w:bookmarkEnd w:id="816798723"/>
+    </w:p>
+    <w:p>
+      <w:pPr>
+        <w:pStyle w:val="Heading2"/>
+        <w:suppressLineNumbers w:val="0"/>
+        <w:bidi w:val="0"/>
+        <w:spacing w:before="160" w:beforeAutospacing="off" w:after="80" w:afterAutospacing="off" w:line="279" w:lineRule="auto"/>
+        <w:ind w:left="0" w:right="0"/>
+        <w:jc w:val="left"/>
+      </w:pPr>
+      <w:bookmarkStart w:name="_Toc447761473" w:id="1390558678"/>
+      <w:r>
+        <w:rPr/>
+        <w:t>R</w:t>
+      </w:r>
+      <w:r>
+        <w:rPr/>
+        <w:t>equisitos de Hardware</w:t>
+      </w:r>
+      <w:bookmarkEnd w:id="1390558678"/>
+    </w:p>
+    <w:p>
+      <w:pPr>
+        <w:pStyle w:val="Normal"/>
+      </w:pPr>
+      <w:r>
+        <w:rPr/>
+        <w:t>Consumo de:</w:t>
+      </w:r>
+      <w:r>
+        <w:br/>
+      </w:r>
+      <w:r>
+        <w:rPr/>
+        <w:t>-CPU</w:t>
+      </w:r>
+      <w:r>
+        <w:br/>
+      </w:r>
+      <w:r>
+        <w:rPr/>
+        <w:t>-RAM</w:t>
+      </w:r>
+      <w:r>
+        <w:br/>
+      </w:r>
+      <w:r>
+        <w:rPr/>
+        <w:t>-Disco</w:t>
+      </w:r>
+      <w:r>
+        <w:br/>
+      </w:r>
+      <w:r>
+        <w:rPr/>
+        <w:t>-Red</w:t>
+      </w:r>
+      <w:r>
+        <w:br/>
+      </w:r>
+      <w:r>
+        <w:rPr/>
+        <w:t>-Tiempo de respuesta</w:t>
+      </w:r>
+    </w:p>
+    <w:p>
+      <w:pPr>
+        <w:pStyle w:val="Heading2"/>
+        <w:suppressLineNumbers w:val="0"/>
+        <w:bidi w:val="0"/>
+        <w:spacing w:before="160" w:beforeAutospacing="off" w:after="80" w:afterAutospacing="off" w:line="279" w:lineRule="auto"/>
+        <w:ind w:left="0" w:right="0"/>
+        <w:jc w:val="left"/>
+      </w:pPr>
+      <w:bookmarkStart w:name="_Toc447978699" w:id="577305532"/>
+      <w:r>
+        <w:rPr/>
+        <w:t>R</w:t>
+      </w:r>
+      <w:r>
+        <w:rPr/>
+        <w:t>equisitos de Software</w:t>
+      </w:r>
+      <w:bookmarkEnd w:id="577305532"/>
+    </w:p>
+    <w:p>
+      <w:pPr>
+        <w:pStyle w:val="Normal"/>
+        <w:rPr>
+          <w:b w:val="1"/>
+          <w:bCs w:val="1"/>
+          <w:u w:val="single"/>
+        </w:rPr>
+      </w:pPr>
+      <w:r>
+        <w:rPr/>
+        <w:t>Versión java</w:t>
+      </w:r>
+      <w:r>
+        <w:rPr/>
+        <w:t xml:space="preserve"> - JDK</w:t>
+      </w:r>
+      <w:r>
+        <w:br/>
+      </w:r>
+      <w:r>
+        <w:rPr/>
+        <w:t>Versión</w:t>
+      </w:r>
+      <w:r>
+        <w:rPr/>
+        <w:t xml:space="preserve"> y versión</w:t>
+      </w:r>
+      <w:r>
+        <w:rPr/>
+        <w:t xml:space="preserve"> base de datos</w:t>
+      </w:r>
+      <w:r>
+        <w:br/>
+      </w:r>
+      <w:r>
+        <w:rPr/>
+        <w:t>Arquitectura</w:t>
+      </w:r>
+      <w:r>
+        <w:br/>
+      </w:r>
+      <w:r>
+        <w:rPr/>
+        <w:t>Librerías externas</w:t>
+      </w:r>
+      <w:r>
+        <w:br/>
+      </w:r>
+      <w:r>
+        <w:rPr/>
+        <w:t>Base de dato</w:t>
+      </w:r>
+      <w:r>
+        <w:rPr/>
+        <w:t>s</w:t>
+      </w:r>
+      <w:r>
+        <w:br/>
+      </w:r>
+      <w:r>
+        <w:rPr/>
+        <w:t>Servidor</w:t>
+      </w:r>
+      <w:r>
+        <w:br/>
+      </w:r>
+      <w:r>
+        <w:rPr/>
+        <w:t>Sistema operativo</w:t>
+      </w:r>
     </w:p>
     <w:p>
       <w:pPr>
@@ -388,7 +776,7 @@
           <w:bCs w:val="1"/>
         </w:rPr>
       </w:pPr>
-      <w:bookmarkStart w:name="_Toc2133038377" w:id="450118345"/>
+      <w:bookmarkStart w:name="_Toc2068599848" w:id="1412397111"/>
       <w:r>
         <w:rPr>
           <w:b w:val="1"/>
@@ -396,7 +784,7 @@
         </w:rPr>
         <w:t>Instalación</w:t>
       </w:r>
-      <w:bookmarkEnd w:id="450118345"/>
+      <w:bookmarkEnd w:id="1412397111"/>
     </w:p>
     <w:p>
       <w:pPr>
@@ -411,7 +799,7 @@
           <w:bCs w:val="1"/>
         </w:rPr>
       </w:pPr>
-      <w:bookmarkStart w:name="_Toc1489319826" w:id="1763774500"/>
+      <w:bookmarkStart w:name="_Toc845755088" w:id="1561441274"/>
       <w:r>
         <w:rPr>
           <w:b w:val="1"/>
@@ -419,7 +807,7 @@
         </w:rPr>
         <w:t>Guía de uso</w:t>
       </w:r>
-      <w:bookmarkEnd w:id="1763774500"/>
+      <w:bookmarkEnd w:id="1561441274"/>
     </w:p>
     <w:p>
       <w:pPr>
@@ -430,7 +818,7 @@
           <w:bCs w:val="1"/>
         </w:rPr>
       </w:pPr>
-      <w:bookmarkStart w:name="_Toc1775807923" w:id="1256058515"/>
+      <w:bookmarkStart w:name="_Toc1447281205" w:id="2143664539"/>
       <w:r>
         <w:rPr>
           <w:b w:val="1"/>
@@ -438,7 +826,7 @@
         </w:rPr>
         <w:t>Problemas frecuentes y solución</w:t>
       </w:r>
-      <w:bookmarkEnd w:id="1256058515"/>
+      <w:bookmarkEnd w:id="2143664539"/>
     </w:p>
     <w:p/>
     <w:p/>
@@ -1338,6 +1726,39 @@
       </w:tblCellMar>
     </w:tblPr>
   </w:style>
+  <w:style w:type="paragraph" w:styleId="Heading2">
+    <w:uiPriority w:val="9"/>
+    <w:name w:val="heading 2"/>
+    <w:basedOn w:val="Normal"/>
+    <w:next w:val="Normal"/>
+    <w:unhideWhenUsed/>
+    <w:qFormat/>
+    <w:rsid w:val="3AA3DF07"/>
+    <w:rPr>
+      <w:rFonts w:ascii="Aptos Display" w:hAnsi="Aptos Display" w:eastAsia="" w:cs="" w:asciiTheme="majorAscii" w:hAnsiTheme="majorAscii" w:eastAsiaTheme="majorEastAsia" w:cstheme="majorBidi"/>
+      <w:color w:val="0F4761" w:themeColor="accent1" w:themeTint="FF" w:themeShade="BF"/>
+      <w:sz w:val="32"/>
+      <w:szCs w:val="32"/>
+    </w:rPr>
+    <w:pPr>
+      <w:keepNext w:val="1"/>
+      <w:keepLines w:val="1"/>
+      <w:spacing w:before="160" w:after="80"/>
+      <w:outlineLvl w:val="1"/>
+    </w:pPr>
+  </w:style>
+  <w:style w:type="paragraph" w:styleId="TOC2">
+    <w:uiPriority w:val="39"/>
+    <w:name w:val="toc 2"/>
+    <w:basedOn w:val="Normal"/>
+    <w:next w:val="Normal"/>
+    <w:unhideWhenUsed/>
+    <w:rsid w:val="3AA3DF07"/>
+    <w:pPr>
+      <w:spacing w:after="100"/>
+      <w:ind w:left="220"/>
+    </w:pPr>
+  </w:style>
 </w:styles>
 </file>
 

</xml_diff>